<commit_message>
Readiness file before the lenders, its timeline and the early warning (phase D, ADR 0024)
db/static/049 reads an assessment with its company's facilities, covenants and
reporting obligations: the lender's dates within the tenant's lead time (setting
fin.readiness.lead_months, 6 by the owner's decision 34) with a RED, AMBER or GREEN
readiness by fixed rules (BR-FIN-038); what the lender will most likely ask; the
timeline of remedies before the fiscal year end and of requests 30 days before the
first lender date; and today's early warning on the latest assessment of each company.

Test CA20 (20 credit assessment tests, 142 engine cases); the platform seed holds ten
settings.

Co-Authored-By: Claude Opus 5.5 <noreply@anthropic.com>
Claude-Session: https://claude.ai/code/session_012HHcRrzuvMBTL2FYxXtsyv
</commit_message>
<xml_diff>
--- a/treasury-platform/docs/36-INTERNAL-PERSPECTIVE-STUDY.docx
+++ b/treasury-platform/docs/36-INTERNAL-PERSPECTIVE-STUDY.docx
@@ -271,7 +271,7 @@
                 <w:szCs w:val="18"/>
                 <w:rtl/>
               </w:rPr>
-              <w:t xml:space="preserve">اعتمدها المالك في 2026-10-20 (القرار 34) بمقترحاتها؛ بُنيت المراحل أ وب وج، والباقي ينتظر</w:t>
+              <w:t xml:space="preserve">اعتمدها المالك في 2026-10-20 (القرار 34) بمقترحاتها؛ بُنيت المراحل أ وب وج ود، والباقي ينتظر</w:t>
             </w:r>
           </w:p>
         </w:tc>
@@ -4806,6 +4806,39 @@
           <w:rtl/>
         </w:rPr>
         <w:t xml:space="preserve"> (بطلب المالك 2026-10-20): نسخ العرض البديلة ومقارنتها وتحويل المختارة إلى قائمة مسودة (ADR 0023، FR-FIN-036، BR-FIN-037، الاختبار CA19).</w:t>
+      </w:r>
+    </w:p>
+    <w:p>
+      <w:pPr>
+        <w:pStyle w:val="ListParagraph"/>
+        <w:numPr>
+          <w:ilvl w:val="0"/>
+          <w:numId w:val="4"/>
+        </w:numPr>
+        <w:bidi/>
+        <w:spacing w:after="70" w:before="0" w:line="300"/>
+      </w:pPr>
+      <w:r>
+        <w:rPr>
+          <w:rFonts w:ascii="Arial" w:cs="Arial" w:eastAsia="Arial" w:hAnsi="Arial"/>
+          <w:b/>
+          <w:bCs/>
+          <w:sz w:val="21"/>
+          <w:szCs w:val="21"/>
+          <w:rtl/>
+        </w:rPr>
+        <w:t xml:space="preserve">المرحلة د</w:t>
+      </w:r>
+      <w:r>
+        <w:rPr>
+          <w:rFonts w:ascii="Arial" w:cs="Arial" w:eastAsia="Arial" w:hAnsi="Arial"/>
+          <w:b w:val="false"/>
+          <w:bCs w:val="false"/>
+          <w:sz w:val="21"/>
+          <w:szCs w:val="21"/>
+          <w:rtl/>
+        </w:rPr>
+        <w:t xml:space="preserve"> (بطلب المالك 2026-10-20): ملف الجاهزية قبل جهة التمويل، والجدول الزمني، والإنذار المبكر بستة أشهر (ADR 0024، FR-FIN-037، BR-FIN-038، الاختبار CA20).</w:t>
       </w:r>
     </w:p>
     <w:p>

</xml_diff>

<commit_message>
Budget statements assessed before the plan is carried out (phase E, ADR 0025)
fin.FinancialStatement.Nature (ACTUAL or BUDGET). A budget is the management's, stays a
draft and has its own series, so no use of approved statements ever reads it; it is
assessed by a trial only, read with the assurance and opinion of the actual statement
it is compared with so the plan alone shows. fin.v_BudgetComparison and
fin.v_BudgetFactorComparison set it beside the latest assessment of an actual year;
alternatives of a plan are presentation versions of the budget; a budget raises no
early warning.

The comparison of grades in 048 and 049 casts the tinyint notch numbers before
subtracting them, as a negative difference overflowed. Test CA21 (21 credit
assessment tests, 142 engine cases).

Co-Authored-By: Claude Opus 5.5 <noreply@anthropic.com>
Claude-Session: https://claude.ai/code/session_012HHcRrzuvMBTL2FYxXtsyv
</commit_message>
<xml_diff>
--- a/treasury-platform/docs/36-INTERNAL-PERSPECTIVE-STUDY.docx
+++ b/treasury-platform/docs/36-INTERNAL-PERSPECTIVE-STUDY.docx
@@ -271,7 +271,7 @@
                 <w:szCs w:val="18"/>
                 <w:rtl/>
               </w:rPr>
-              <w:t xml:space="preserve">اعتمدها المالك في 2026-10-20 (القرار 34) بمقترحاتها؛ بُنيت المراحل أ وب وج ود، والباقي ينتظر</w:t>
+              <w:t xml:space="preserve">اعتمدها المالك في 2026-10-20 (القرار 34) بمقترحاتها؛ بُنيت المراحل أ إلى هـ، والمرحلة و تنتظر</w:t>
             </w:r>
           </w:p>
         </w:tc>
@@ -4839,6 +4839,39 @@
           <w:rtl/>
         </w:rPr>
         <w:t xml:space="preserve"> (بطلب المالك 2026-10-20): ملف الجاهزية قبل جهة التمويل، والجدول الزمني، والإنذار المبكر بستة أشهر (ADR 0024، FR-FIN-037، BR-FIN-038، الاختبار CA20).</w:t>
+      </w:r>
+    </w:p>
+    <w:p>
+      <w:pPr>
+        <w:pStyle w:val="ListParagraph"/>
+        <w:numPr>
+          <w:ilvl w:val="0"/>
+          <w:numId w:val="4"/>
+        </w:numPr>
+        <w:bidi/>
+        <w:spacing w:after="70" w:before="0" w:line="300"/>
+      </w:pPr>
+      <w:r>
+        <w:rPr>
+          <w:rFonts w:ascii="Arial" w:cs="Arial" w:eastAsia="Arial" w:hAnsi="Arial"/>
+          <w:b/>
+          <w:bCs/>
+          <w:sz w:val="21"/>
+          <w:szCs w:val="21"/>
+          <w:rtl/>
+        </w:rPr>
+        <w:t xml:space="preserve">المرحلة هـ</w:t>
+      </w:r>
+      <w:r>
+        <w:rPr>
+          <w:rFonts w:ascii="Arial" w:cs="Arial" w:eastAsia="Arial" w:hAnsi="Arial"/>
+          <w:b w:val="false"/>
+          <w:bCs w:val="false"/>
+          <w:sz w:val="21"/>
+          <w:szCs w:val="21"/>
+          <w:rtl/>
+        </w:rPr>
+        <w:t xml:space="preserve"> (بطلب المالك 2026-10-20): تقييم القوائم التقديرية (الموازنة) ومقارنتها بالسنة الفعلية (ADR 0025، FR-FIN-038، BR-FIN-039، الاختبار CA21).</w:t>
       </w:r>
     </w:p>
     <w:p>

</xml_diff>

<commit_message>
Ratings a lender communicates, compared with the company's assessment (phase F, ADR 0026)
fin.LenderRating holds a rating a lender gave the company: its own label, its
equivalent on the 21-grade scale (given by the lender or mapped by the treasury, which
keeps the label), the reasons, the source stamp. fin.v_LenderRatingComparison sets it
beside the assessment of its date with the gap and its direction;
fin.v_LenderRatingGapDrivers lists where they part: the metrics on the side of the gap,
the adjustments and ceilings. The readiness of a renewal reads the lender's latest
rating: RED at B3 or worse, AMBER two notches or more below the assessment.

Test CA22 (22 credit assessment tests, 142 engine cases); the redacted source text of
the new table makes 16 such columns (DR-31 check and RF18).

Co-Authored-By: Claude Opus 5.5 <noreply@anthropic.com>
Claude-Session: https://claude.ai/code/session_012HHcRrzuvMBTL2FYxXtsyv
</commit_message>
<xml_diff>
--- a/treasury-platform/docs/36-INTERNAL-PERSPECTIVE-STUDY.docx
+++ b/treasury-platform/docs/36-INTERNAL-PERSPECTIVE-STUDY.docx
@@ -271,7 +271,7 @@
                 <w:szCs w:val="18"/>
                 <w:rtl/>
               </w:rPr>
-              <w:t xml:space="preserve">اعتمدها المالك في 2026-10-20 (القرار 34) بمقترحاتها؛ بُنيت المراحل أ إلى هـ، والمرحلة و تنتظر</w:t>
+              <w:t xml:space="preserve">اعتمدها المالك في 2026-10-20 (القرار 34) بمقترحاتها؛ بُنيت المراحل الست كلها (أ إلى و)</w:t>
             </w:r>
           </w:p>
         </w:tc>
@@ -4872,6 +4872,39 @@
           <w:rtl/>
         </w:rPr>
         <w:t xml:space="preserve"> (بطلب المالك 2026-10-20): تقييم القوائم التقديرية (الموازنة) ومقارنتها بالسنة الفعلية (ADR 0025، FR-FIN-038، BR-FIN-039، الاختبار CA21).</w:t>
+      </w:r>
+    </w:p>
+    <w:p>
+      <w:pPr>
+        <w:pStyle w:val="ListParagraph"/>
+        <w:numPr>
+          <w:ilvl w:val="0"/>
+          <w:numId w:val="4"/>
+        </w:numPr>
+        <w:bidi/>
+        <w:spacing w:after="70" w:before="0" w:line="300"/>
+      </w:pPr>
+      <w:r>
+        <w:rPr>
+          <w:rFonts w:ascii="Arial" w:cs="Arial" w:eastAsia="Arial" w:hAnsi="Arial"/>
+          <w:b/>
+          <w:bCs/>
+          <w:sz w:val="21"/>
+          <w:szCs w:val="21"/>
+          <w:rtl/>
+        </w:rPr>
+        <w:t xml:space="preserve">المرحلة و</w:t>
+      </w:r>
+      <w:r>
+        <w:rPr>
+          <w:rFonts w:ascii="Arial" w:cs="Arial" w:eastAsia="Arial" w:hAnsi="Arial"/>
+          <w:b w:val="false"/>
+          <w:bCs w:val="false"/>
+          <w:sz w:val="21"/>
+          <w:szCs w:val="21"/>
+          <w:rtl/>
+        </w:rPr>
+        <w:t xml:space="preserve"> (بطلب المالك 2026-10-20): التصنيف الذي يبلغ به البنك الشركة ومقارنته بتقييمها وموضع الافتراق (ADR 0026، FR-FIN-039، BR-FIN-040، الاختبار CA22).</w:t>
       </w:r>
     </w:p>
     <w:p>

</xml_diff>